<commit_message>
Rebuild all JPMC materials: correct format, work history, and deeper research
Resume:
- Gray-blue sidebar format matching template (not dark navy)
- Correct work history: Office Depot (current), Little & Associates, Bayou DeSiard
- Real credentials: J.D., CPA (AR/LA), Bar License, B.Accy.
- Actual bullet points from master resume with metrics (15%, 10%, 20%)

Cover letter:
- Office Depot as current role, not Bayou DeSiard
- References Monroe as global document custody/collateral review hub
- References Ruston Operations Center expansion
- References LLM Suite (2025 Innovation of the Year) and 1,000+ AI use cases

Cold email to Steve Roop:
- Hooks: Business Leader of the Year, 307th Bomb Wing, Ark-La-Tex board
- New hook: $1.5T Security and Resiliency Initiative he shared on LinkedIn
- Shows knowledge of Monroe vault/custody operations specifically
- Correct credentials and employment throughout

https://claude.ai/code/session_01FDYhPQsySRjVXRDDMYJ3Ar
</commit_message>
<xml_diff>
--- a/Chase_Kinslow_CoverLetter_JPMorganChase.docx
+++ b/Chase_Kinslow_CoverLetter_JPMorganChase.docx
@@ -95,7 +95,7 @@
         <w:spacing w:after="40"/>
       </w:pPr>
       <w:r>
-        <w:t>I am writing to express my strong interest in the Transactions Specialist II position at JPMorgan Chase in Monroe, Louisiana. With a Bachelor of Accountancy from the University of Mississippi and direct experience in high-volume transaction processing, document handling, cash reconciliation, and regulatory compliance, I am confident I can contribute to your operations team from day one.</w:t>
+        <w:t>I am writing to apply for the Transactions Specialist II position at the Monroe Operations Center. With a CPA license, a J.D., a Bachelor of Accountancy, and direct experience processing high-volume transactions, managing daily cash reconciliation, and maintaining audit-ready documentation in deadline-driven environments, I can contribute to your collateral review and document custody operations immediately.</w:t>
       </w:r>
     </w:p>
     <w:p>
@@ -108,7 +108,7 @@
         <w:spacing w:after="40"/>
       </w:pPr>
       <w:r>
-        <w:t>In my current role at Bayou DeSiard Country Club, I manage daily operations and logistics that require the same precision and structured execution this role demands — processing transactions accurately, maintaining production standards, and coordinating across departments to keep operations running smoothly. Previously, as an Accountant at Little and Associates, LLC, I managed documentation workflows where zero-error precision was non-negotiable: reconciliations, workpapers, and client submissions where a single discrepancy could disqualify an entire project file. That experience built the exact discipline required for processing and clearing transactions with the accuracy JPMorgan Chase expects.</w:t>
+        <w:t>I currently work as a Sales Associate at Office Depot, where I operate POS systems processing transactions all day with zero-error accuracy, manage daily register reconciliation and cash handling, and maintain inventory control systems that reduced stockouts by 10% and discrepancies by 15%. Before that, I spent three years as an Accountant at Little and Associates, LLC, where I developed parallel reconciliation models in Excel, managed comprehensive LIHTC audit fieldwork including GAAP-compliant adjustments and HUD-tailored supplemental schedules, and co-administered end-to-end compliance application preparation where a single discrepancy could disqualify an entire project file.</w:t>
       </w:r>
     </w:p>
     <w:p>
@@ -121,7 +121,7 @@
         <w:spacing w:after="40"/>
       </w:pPr>
       <w:r>
-        <w:t>What draws me to this opportunity specifically is Chase’s 30-year investment in North Louisiana — with nearly 1,000 employees at the Monroe campus and the recent opening of the Ruston Operations Center, it’s clear the firm is committed to growing operations here. I want to be part of that growth. I am also excited by JPMorgan Chase’s push toward AI and automation in transaction processing. I am eager to develop proficiency with these technologies and contribute to innovation efforts that optimize how work gets done.</w:t>
+        <w:t>That combination — transaction processing speed and accuracy from retail, plus the documentation rigor and compliance discipline from public accounting — maps directly to what this role requires: processing and clearing transactions on time, handling customer inquiries, maintaining production and quality standards, and escalating non-routine issues with good judgment.</w:t>
       </w:r>
     </w:p>
     <w:p>
@@ -134,7 +134,7 @@
         <w:spacing w:after="40"/>
       </w:pPr>
       <w:r>
-        <w:t>I bring strong critical thinking and problem-solving skills, a track record of handling customer inquiries with a positive-experience mindset, and the ability to escalate non-routine issues by applying common sense and experience from similar situations. I am comfortable sitting for extended periods, maintaining focus on detail-intensive work, and operating in a structured, supervised environment.</w:t>
+        <w:t>I understand the Monroe campus serves as a hub for global document custody and collateral review across home loans, auto loans, and securities, with the new Ruston Operations Center expanding that capacity. I want to be part of that operation. I am also eager to develop proficiency with the AI and automation tools JPMorgan Chase is deploying — including the LLM Suite that won American Banker’s 2025 Innovation of the Year — and contribute to process optimization efforts as the firm scales toward 1,000+ AI use cases.</w:t>
       </w:r>
     </w:p>
     <w:p>
@@ -147,7 +147,20 @@
         <w:spacing w:after="40"/>
       </w:pPr>
       <w:r>
-        <w:t>I would welcome the opportunity to discuss how my background in transaction processing, compliance, and operations aligns with what you need on your team. Thank you for your consideration.</w:t>
+        <w:t>I am local, available immediately, and comfortable with the physical requirements of the role. I would welcome the chance to discuss how my background fits your team.</w:t>
+      </w:r>
+    </w:p>
+    <w:p>
+      <w:pPr>
+        <w:spacing w:after="40"/>
+      </w:pPr>
+    </w:p>
+    <w:p>
+      <w:pPr>
+        <w:spacing w:after="40"/>
+      </w:pPr>
+      <w:r>
+        <w:t>Thank you for your consideration.</w:t>
       </w:r>
     </w:p>
     <w:p>

</xml_diff>

<commit_message>
Final resume + cover letter: correct format, JD-mirrored language
Resume: gray-blue sidebar two-column format matching template
- CONTACT, CORE COMPETENCIES, CREDENTIALS, EDUCATION, TOOLS, ADDITIONAL
- JD-tailored bullets with exact phrase matching
- Both PDF and DOCX now have two-column layout

Cover letter: every paragraph mirrors specific JD requirements
- Para 1: moderately complex tasks, structured/supervised environment
- Para 2: established routines, production/accuracy, extracting/inputting
- Para 3: market products, industry regulations, compliance
- Para 4: customer inquiries, escalation, AI/automation, LLM Suite
- Para 5: Monroe document custody, Ruston expansion, availability

https://claude.ai/code/session_01FDYhPQsySRjVXRDDMYJ3Ar
</commit_message>
<xml_diff>
--- a/Chase_Kinslow_CoverLetter_JPMorganChase.docx
+++ b/Chase_Kinslow_CoverLetter_JPMorganChase.docx
@@ -95,7 +95,7 @@
         <w:spacing w:after="40"/>
       </w:pPr>
       <w:r>
-        <w:t>I am writing to apply for the Transactions Specialist II position at the Monroe Operations Center. With a CPA license, a J.D., a Bachelor of Accountancy, and direct experience processing high-volume transactions, managing daily cash reconciliation, and maintaining audit-ready documentation in deadline-driven environments, I can contribute to your collateral review and document custody operations immediately.</w:t>
+        <w:t>I am writing to apply for the Transactions Specialist II position at the Monroe Operations Center. With a CPA license, a Juris Doctor, and a Bachelor of Accountancy, I have three years of direct experience processing, clearing, and servicing document transactions involving moderately complex tasks — and I am ready to contribute to your team within the structured and supervised environment this role operates in.</w:t>
       </w:r>
     </w:p>
     <w:p>
@@ -108,7 +108,7 @@
         <w:spacing w:after="40"/>
       </w:pPr>
       <w:r>
-        <w:t>I currently work as a Sales Associate at Office Depot, where I operate POS systems processing transactions all day with zero-error accuracy, manage daily register reconciliation and cash handling, and maintain inventory control systems that reduced stockouts by 10% and discrepancies by 15%. Before that, I spent three years as an Accountant at Little and Associates, LLC, where I developed parallel reconciliation models in Excel, managed comprehensive LIHTC audit fieldwork including GAAP-compliant adjustments and HUD-tailored supplemental schedules, and co-administered end-to-end compliance application preparation where a single discrepancy could disqualify an entire project file.</w:t>
+        <w:t>I currently process and clear high-volume transactions daily at Office Depot, adhering to established routines and standard operating procedures while maintaining the highest standards of production and accuracy. I manage daily register reconciliation, cash handling, and inventory control by extracting data and inputting it into digital tracking systems — reducing cash discrepancies by 15% and stockouts by 10%. This is the same discipline required for extracting checks and remittances from envelopes, inputting data into systems, and maintaining accuracy under production pressure.</w:t>
       </w:r>
     </w:p>
     <w:p>
@@ -121,7 +121,7 @@
         <w:spacing w:after="40"/>
       </w:pPr>
       <w:r>
-        <w:t>That combination — transaction processing speed and accuracy from retail, plus the documentation rigor and compliance discipline from public accounting — maps directly to what this role requires: processing and clearing transactions on time, handling customer inquiries, maintaining production and quality standards, and escalating non-routine issues with good judgment.</w:t>
+        <w:t>Previously, as an Accountant at Little and Associates, LLC, I processed and cleared document transactions across LIHTC, HUD, and GAAP regulatory frameworks where a single discrepancy disqualified an entire project file. I built parallel reconciliation models to track financial data sets, managed comprehensive audit fieldwork including GAAP-compliant adjustments and HUD-tailored supplemental schedules, and maintained up-to-date knowledge of market products and industry regulations — applying that knowledge to ensure compliance in all transaction and submission activities.</w:t>
       </w:r>
     </w:p>
     <w:p>
@@ -134,7 +134,7 @@
         <w:spacing w:after="40"/>
       </w:pPr>
       <w:r>
-        <w:t>I understand the Monroe campus serves as a hub for global document custody and collateral review across home loans, auto loans, and securities, with the new Ruston Operations Center expanding that capacity. I want to be part of that operation. I am also eager to develop proficiency with the AI and automation tools JPMorgan Chase is deploying — including the LLM Suite that won American Banker’s 2025 Innovation of the Year — and contribute to process optimization efforts as the firm scales toward 1,000+ AI use cases.</w:t>
+        <w:t>I am experienced handling customer inquiries and requests, providing a positive customer experience at all touchpoints. I escalate non-routine issues to senior team members by applying common sense and experience of similar situations to identify potential solutions — an approach that reduced service disruptions by 20% in my most recent operations role. I am also developing proficiency in AI and automation tools to optimize transaction processes, and I am eager to contribute to JPMorgan Chase’s innovation efforts as the firm scales toward 1,000+ AI use cases through tools like the LLM Suite.</w:t>
       </w:r>
     </w:p>
     <w:p>
@@ -147,7 +147,7 @@
         <w:spacing w:after="40"/>
       </w:pPr>
       <w:r>
-        <w:t>I am local, available immediately, and comfortable with the physical requirements of the role. I would welcome the chance to discuss how my background fits your team.</w:t>
+        <w:t>I understand the Monroe campus serves as a hub for global document custody and collateral review across home loans, auto loans, and securities, with the new $31 million Ruston Operations Center expanding that capacity. I am local, available immediately, and comfortable with the physical requirements of the role. I would welcome the chance to discuss how my background fits your team.</w:t>
       </w:r>
     </w:p>
     <w:p>

</xml_diff>